<commit_message>
Tambah paket D16-D18 dan dokumen gabungan pencegahan perundungan
Co-Authored-By: Claude Sonnet 5.5 <noreply@anthropic.com>
Claude-Session: https://claude.ai/code/session_01VXziMfmrv7azvn2pJgs4Ud
</commit_message>
<xml_diff>
--- a/docs/bullying-sdit/D01_TataKelola_Een_v01.docx
+++ b/docs/bullying-sdit/D01_TataKelola_Een_v01.docx
@@ -357,6 +357,7 @@
       <w:tblPr>
         <w:tblW w:type="auto" w:w="0"/>
         <w:jc w:val="center"/>
+        <w:tblLayout w:type="fixed"/>
         <w:tblLook w:firstColumn="1" w:firstRow="1" w:lastColumn="0" w:lastRow="0" w:noHBand="0" w:noVBand="1" w:val="04A0"/>
         <w:tblBorders>
           <w:top w:val="single" w:sz="4" w:color="BFC9C2"/>
@@ -368,8 +369,8 @@
         </w:tblBorders>
       </w:tblPr>
       <w:tblGrid>
-        <w:gridCol w:w="4819"/>
-        <w:gridCol w:w="4819"/>
+        <w:gridCol w:w="2268"/>
+        <w:gridCol w:w="7370"/>
       </w:tblGrid>
       <w:tr>
         <w:tc>
@@ -737,6 +738,7 @@
       <w:tblPr>
         <w:tblW w:type="auto" w:w="0"/>
         <w:jc w:val="center"/>
+        <w:tblLayout w:type="fixed"/>
         <w:tblLook w:firstColumn="1" w:firstRow="1" w:lastColumn="0" w:lastRow="0" w:noHBand="0" w:noVBand="1" w:val="04A0"/>
         <w:tblBorders>
           <w:top w:val="single" w:sz="4" w:color="BFC9C2"/>
@@ -748,12 +750,12 @@
         </w:tblBorders>
       </w:tblPr>
       <w:tblGrid>
-        <w:gridCol w:w="1606"/>
-        <w:gridCol w:w="1606"/>
-        <w:gridCol w:w="1606"/>
-        <w:gridCol w:w="1606"/>
-        <w:gridCol w:w="1606"/>
-        <w:gridCol w:w="1606"/>
+        <w:gridCol w:w="454"/>
+        <w:gridCol w:w="2608"/>
+        <w:gridCol w:w="1474"/>
+        <w:gridCol w:w="1701"/>
+        <w:gridCol w:w="1474"/>
+        <w:gridCol w:w="1928"/>
       </w:tblGrid>
       <w:tr>
         <w:tc>
@@ -1531,6 +1533,7 @@
       <w:tblPr>
         <w:tblW w:type="auto" w:w="0"/>
         <w:jc w:val="center"/>
+        <w:tblLayout w:type="fixed"/>
         <w:tblLook w:firstColumn="1" w:firstRow="1" w:lastColumn="0" w:lastRow="0" w:noHBand="0" w:noVBand="1" w:val="04A0"/>
         <w:tblBorders>
           <w:top w:val="single" w:sz="4" w:color="BFC9C2"/>
@@ -1542,9 +1545,9 @@
         </w:tblBorders>
       </w:tblPr>
       <w:tblGrid>
-        <w:gridCol w:w="3213"/>
-        <w:gridCol w:w="3213"/>
-        <w:gridCol w:w="3213"/>
+        <w:gridCol w:w="1928"/>
+        <w:gridCol w:w="4535"/>
+        <w:gridCol w:w="3175"/>
       </w:tblGrid>
       <w:tr>
         <w:tc>
@@ -1865,6 +1868,7 @@
       <w:tblPr>
         <w:tblW w:type="auto" w:w="0"/>
         <w:jc w:val="center"/>
+        <w:tblLayout w:type="fixed"/>
         <w:tblLook w:firstColumn="1" w:firstRow="1" w:lastColumn="0" w:lastRow="0" w:noHBand="0" w:noVBand="1" w:val="04A0"/>
         <w:tblBorders>
           <w:top w:val="single" w:sz="4" w:color="BFC9C2"/>
@@ -1876,10 +1880,10 @@
         </w:tblBorders>
       </w:tblPr>
       <w:tblGrid>
-        <w:gridCol w:w="2409"/>
-        <w:gridCol w:w="2409"/>
-        <w:gridCol w:w="2409"/>
-        <w:gridCol w:w="2409"/>
+        <w:gridCol w:w="3175"/>
+        <w:gridCol w:w="2494"/>
+        <w:gridCol w:w="1134"/>
+        <w:gridCol w:w="2835"/>
       </w:tblGrid>
       <w:tr>
         <w:tc>
@@ -2417,6 +2421,7 @@
       <w:tblPr>
         <w:tblW w:type="auto" w:w="0"/>
         <w:jc w:val="center"/>
+        <w:tblLayout w:type="fixed"/>
         <w:tblLook w:firstColumn="1" w:firstRow="1" w:lastColumn="0" w:lastRow="0" w:noHBand="0" w:noVBand="1" w:val="04A0"/>
         <w:tblBorders>
           <w:top w:val="single" w:sz="4" w:color="BFC9C2"/>
@@ -2428,10 +2433,10 @@
         </w:tblBorders>
       </w:tblPr>
       <w:tblGrid>
-        <w:gridCol w:w="2409"/>
-        <w:gridCol w:w="2409"/>
-        <w:gridCol w:w="2409"/>
-        <w:gridCol w:w="2409"/>
+        <w:gridCol w:w="1928"/>
+        <w:gridCol w:w="2154"/>
+        <w:gridCol w:w="3061"/>
+        <w:gridCol w:w="2494"/>
       </w:tblGrid>
       <w:tr>
         <w:tc>
@@ -2913,6 +2918,7 @@
       <w:tblPr>
         <w:tblW w:type="auto" w:w="0"/>
         <w:jc w:val="center"/>
+        <w:tblLayout w:type="fixed"/>
         <w:tblLook w:firstColumn="1" w:firstRow="1" w:lastColumn="0" w:lastRow="0" w:noHBand="0" w:noVBand="1" w:val="04A0"/>
         <w:tblBorders>
           <w:top w:val="single" w:sz="4" w:color="BFC9C2"/>
@@ -2924,9 +2930,9 @@
         </w:tblBorders>
       </w:tblPr>
       <w:tblGrid>
-        <w:gridCol w:w="3213"/>
-        <w:gridCol w:w="3213"/>
-        <w:gridCol w:w="3213"/>
+        <w:gridCol w:w="2835"/>
+        <w:gridCol w:w="4535"/>
+        <w:gridCol w:w="2268"/>
       </w:tblGrid>
       <w:tr>
         <w:tc>
@@ -3211,6 +3217,7 @@
       <w:tblPr>
         <w:tblW w:type="auto" w:w="0"/>
         <w:jc w:val="center"/>
+        <w:tblLayout w:type="fixed"/>
         <w:tblLook w:firstColumn="1" w:firstRow="1" w:lastColumn="0" w:lastRow="0" w:noHBand="0" w:noVBand="1" w:val="04A0"/>
         <w:tblBorders>
           <w:top w:val="single" w:sz="4" w:color="BFC9C2"/>
@@ -3222,12 +3229,12 @@
         </w:tblBorders>
       </w:tblPr>
       <w:tblGrid>
-        <w:gridCol w:w="1606"/>
-        <w:gridCol w:w="1606"/>
-        <w:gridCol w:w="1606"/>
-        <w:gridCol w:w="1606"/>
-        <w:gridCol w:w="1606"/>
-        <w:gridCol w:w="1606"/>
+        <w:gridCol w:w="2154"/>
+        <w:gridCol w:w="1644"/>
+        <w:gridCol w:w="1644"/>
+        <w:gridCol w:w="1361"/>
+        <w:gridCol w:w="1361"/>
+        <w:gridCol w:w="1474"/>
       </w:tblGrid>
       <w:tr>
         <w:tc>
@@ -3847,6 +3854,7 @@
       <w:tblPr>
         <w:tblW w:type="auto" w:w="0"/>
         <w:jc w:val="center"/>
+        <w:tblLayout w:type="fixed"/>
         <w:tblLook w:firstColumn="1" w:firstRow="1" w:lastColumn="0" w:lastRow="0" w:noHBand="0" w:noVBand="1" w:val="04A0"/>
         <w:tblBorders>
           <w:top w:val="single" w:sz="4" w:color="BFC9C2"/>
@@ -3858,12 +3866,12 @@
         </w:tblBorders>
       </w:tblPr>
       <w:tblGrid>
-        <w:gridCol w:w="1606"/>
-        <w:gridCol w:w="1606"/>
-        <w:gridCol w:w="1606"/>
-        <w:gridCol w:w="1606"/>
-        <w:gridCol w:w="1606"/>
-        <w:gridCol w:w="1606"/>
+        <w:gridCol w:w="1361"/>
+        <w:gridCol w:w="1361"/>
+        <w:gridCol w:w="2608"/>
+        <w:gridCol w:w="1361"/>
+        <w:gridCol w:w="1361"/>
+        <w:gridCol w:w="1587"/>
       </w:tblGrid>
       <w:tr>
         <w:tc>
@@ -4563,6 +4571,7 @@
       <w:tblPr>
         <w:tblW w:type="auto" w:w="0"/>
         <w:jc w:val="center"/>
+        <w:tblLayout w:type="fixed"/>
         <w:tblLook w:firstColumn="1" w:firstRow="1" w:lastColumn="0" w:lastRow="0" w:noHBand="0" w:noVBand="1" w:val="04A0"/>
         <w:tblBorders>
           <w:top w:val="single" w:sz="4" w:color="BFC9C2"/>
@@ -4574,8 +4583,8 @@
         </w:tblBorders>
       </w:tblPr>
       <w:tblGrid>
-        <w:gridCol w:w="4819"/>
-        <w:gridCol w:w="4819"/>
+        <w:gridCol w:w="3402"/>
+        <w:gridCol w:w="6236"/>
       </w:tblGrid>
       <w:tr>
         <w:tc>
@@ -4821,6 +4830,7 @@
       <w:tblPr>
         <w:tblW w:type="auto" w:w="0"/>
         <w:jc w:val="center"/>
+        <w:tblLayout w:type="fixed"/>
         <w:tblLook w:firstColumn="1" w:firstRow="1" w:lastColumn="0" w:lastRow="0" w:noHBand="0" w:noVBand="1" w:val="04A0"/>
         <w:tblBorders>
           <w:top w:val="single" w:sz="4" w:color="BFC9C2"/>
@@ -4832,10 +4842,10 @@
         </w:tblBorders>
       </w:tblPr>
       <w:tblGrid>
-        <w:gridCol w:w="2409"/>
-        <w:gridCol w:w="2409"/>
-        <w:gridCol w:w="2409"/>
-        <w:gridCol w:w="2409"/>
+        <w:gridCol w:w="567"/>
+        <w:gridCol w:w="3402"/>
+        <w:gridCol w:w="2835"/>
+        <w:gridCol w:w="2835"/>
       </w:tblGrid>
       <w:tr>
         <w:tc>
@@ -5357,6 +5367,7 @@
       <w:tblPr>
         <w:tblW w:type="auto" w:w="0"/>
         <w:jc w:val="center"/>
+        <w:tblLayout w:type="fixed"/>
         <w:tblLook w:firstColumn="1" w:firstRow="1" w:lastColumn="0" w:lastRow="0" w:noHBand="0" w:noVBand="1" w:val="04A0"/>
         <w:tblBorders>
           <w:top w:val="single" w:sz="4" w:color="BFC9C2"/>
@@ -5368,8 +5379,8 @@
         </w:tblBorders>
       </w:tblPr>
       <w:tblGrid>
-        <w:gridCol w:w="4819"/>
-        <w:gridCol w:w="4819"/>
+        <w:gridCol w:w="3402"/>
+        <w:gridCol w:w="6236"/>
       </w:tblGrid>
       <w:tr>
         <w:tc>
@@ -5558,6 +5569,7 @@
       <w:tblPr>
         <w:tblW w:type="auto" w:w="0"/>
         <w:jc w:val="center"/>
+        <w:tblLayout w:type="fixed"/>
         <w:tblLook w:firstColumn="1" w:firstRow="1" w:lastColumn="0" w:lastRow="0" w:noHBand="0" w:noVBand="1" w:val="04A0"/>
         <w:tblBorders>
           <w:top w:val="single" w:sz="4" w:color="BFC9C2"/>
@@ -5569,12 +5581,12 @@
         </w:tblBorders>
       </w:tblPr>
       <w:tblGrid>
-        <w:gridCol w:w="1606"/>
-        <w:gridCol w:w="1606"/>
-        <w:gridCol w:w="1606"/>
-        <w:gridCol w:w="1606"/>
-        <w:gridCol w:w="1606"/>
-        <w:gridCol w:w="1606"/>
+        <w:gridCol w:w="510"/>
+        <w:gridCol w:w="1191"/>
+        <w:gridCol w:w="3402"/>
+        <w:gridCol w:w="1814"/>
+        <w:gridCol w:w="1417"/>
+        <w:gridCol w:w="1304"/>
       </w:tblGrid>
       <w:tr>
         <w:tc>
@@ -6075,6 +6087,7 @@
       <w:tblPr>
         <w:tblW w:type="auto" w:w="0"/>
         <w:jc w:val="center"/>
+        <w:tblLayout w:type="fixed"/>
         <w:tblLook w:firstColumn="1" w:firstRow="1" w:lastColumn="0" w:lastRow="0" w:noHBand="0" w:noVBand="1" w:val="04A0"/>
         <w:tblBorders>
           <w:top w:val="single" w:sz="4" w:color="BFC9C2"/>
@@ -6086,11 +6099,11 @@
         </w:tblBorders>
       </w:tblPr>
       <w:tblGrid>
-        <w:gridCol w:w="1928"/>
-        <w:gridCol w:w="1928"/>
-        <w:gridCol w:w="1928"/>
-        <w:gridCol w:w="1928"/>
-        <w:gridCol w:w="1928"/>
+        <w:gridCol w:w="1077"/>
+        <w:gridCol w:w="3231"/>
+        <w:gridCol w:w="1474"/>
+        <w:gridCol w:w="2721"/>
+        <w:gridCol w:w="1134"/>
       </w:tblGrid>
       <w:tr>
         <w:tc>
@@ -6744,6 +6757,7 @@
       <w:tblPr>
         <w:tblW w:type="auto" w:w="0"/>
         <w:jc w:val="center"/>
+        <w:tblLayout w:type="fixed"/>
         <w:tblLook w:firstColumn="1" w:firstRow="1" w:lastColumn="0" w:lastRow="0" w:noHBand="0" w:noVBand="1" w:val="04A0"/>
         <w:tblBorders>
           <w:top w:val="single" w:sz="4" w:color="BFC9C2"/>
@@ -6755,8 +6769,8 @@
         </w:tblBorders>
       </w:tblPr>
       <w:tblGrid>
-        <w:gridCol w:w="4819"/>
-        <w:gridCol w:w="4819"/>
+        <w:gridCol w:w="3402"/>
+        <w:gridCol w:w="6236"/>
       </w:tblGrid>
       <w:tr>
         <w:tc>
@@ -6975,6 +6989,7 @@
       <w:tblPr>
         <w:tblW w:type="auto" w:w="0"/>
         <w:jc w:val="center"/>
+        <w:tblLayout w:type="fixed"/>
         <w:tblLook w:firstColumn="1" w:firstRow="1" w:lastColumn="0" w:lastRow="0" w:noHBand="0" w:noVBand="1" w:val="04A0"/>
         <w:tblBorders>
           <w:top w:val="single" w:sz="4" w:color="BFC9C2"/>
@@ -6986,10 +7001,10 @@
         </w:tblBorders>
       </w:tblPr>
       <w:tblGrid>
-        <w:gridCol w:w="1928"/>
-        <w:gridCol w:w="1928"/>
-        <w:gridCol w:w="1928"/>
-        <w:gridCol w:w="1928"/>
+        <w:gridCol w:w="510"/>
+        <w:gridCol w:w="5669"/>
+        <w:gridCol w:w="680"/>
+        <w:gridCol w:w="850"/>
         <w:gridCol w:w="1928"/>
       </w:tblGrid>
       <w:tr>
@@ -7690,6 +7705,7 @@
       <w:tblPr>
         <w:tblW w:type="auto" w:w="0"/>
         <w:jc w:val="center"/>
+        <w:tblLayout w:type="fixed"/>
         <w:tblLook w:firstColumn="1" w:firstRow="1" w:lastColumn="0" w:lastRow="0" w:noHBand="0" w:noVBand="1" w:val="04A0"/>
         <w:tblBorders>
           <w:top w:val="single" w:sz="4" w:color="BFC9C2"/>
@@ -7701,8 +7717,8 @@
         </w:tblBorders>
       </w:tblPr>
       <w:tblGrid>
-        <w:gridCol w:w="4819"/>
-        <w:gridCol w:w="4819"/>
+        <w:gridCol w:w="2835"/>
+        <w:gridCol w:w="6803"/>
       </w:tblGrid>
       <w:tr>
         <w:tc>

</xml_diff>